<commit_message>
Pushing adjusted file - 03/23/26
</commit_message>
<xml_diff>
--- a/module-1/Shinsato-Assignment1_2.docx
+++ b/module-1/Shinsato-Assignment1_2.docx
@@ -4,7 +4,7 @@
   <w:body>
     <w:p>
       <w:r>
-        <w:t xml:space="preserve">Miles Shinsato </w:t>
+        <w:t>Miles Shinsato</w:t>
       </w:r>
     </w:p>
     <w:p>
@@ -14,6 +14,9 @@
     </w:p>
     <w:p>
       <w:r>
+        <w:rPr>
+          <w:noProof/>
+        </w:rPr>
         <w:drawing>
           <wp:inline distT="0" distB="0" distL="0" distR="0" wp14:anchorId="1203640B" wp14:editId="43B9A13A">
             <wp:extent cx="5943600" cy="2982595"/>

</xml_diff>

<commit_message>
Pushing Updated Assignment Document - 03/23/26
</commit_message>
<xml_diff>
--- a/module-1/Shinsato-Assignment1_2.docx
+++ b/module-1/Shinsato-Assignment1_2.docx
@@ -42,6 +42,68 @@
                     <a:xfrm>
                       <a:off x="0" y="0"/>
                       <a:ext cx="5943600" cy="2982595"/>
+                    </a:xfrm>
+                    <a:prstGeom prst="rect">
+                      <a:avLst/>
+                    </a:prstGeom>
+                  </pic:spPr>
+                </pic:pic>
+              </a:graphicData>
+            </a:graphic>
+          </wp:inline>
+        </w:drawing>
+      </w:r>
+    </w:p>
+    <w:p/>
+    <w:p/>
+    <w:p>
+      <w:proofErr w:type="spellStart"/>
+      <w:r>
+        <w:t>Github</w:t>
+      </w:r>
+      <w:proofErr w:type="spellEnd"/>
+      <w:r>
+        <w:t xml:space="preserve"> </w:t>
+      </w:r>
+      <w:r>
+        <w:t xml:space="preserve">URL of Repository: </w:t>
+      </w:r>
+      <w:hyperlink r:id="rId5" w:history="1">
+        <w:r>
+          <w:rPr>
+            <w:rStyle w:val="Hyperlink"/>
+          </w:rPr>
+          <w:t>https://github.com/MShinBV/csd-420.git</w:t>
+        </w:r>
+      </w:hyperlink>
+    </w:p>
+    <w:p>
+      <w:r>
+        <w:drawing>
+          <wp:inline distT="0" distB="0" distL="0" distR="0" wp14:anchorId="24B966C6" wp14:editId="77E3EEE8">
+            <wp:extent cx="5943600" cy="2810510"/>
+            <wp:effectExtent l="0" t="0" r="0" b="8890"/>
+            <wp:docPr id="53590982" name="Picture 1"/>
+            <wp:cNvGraphicFramePr>
+              <a:graphicFrameLocks xmlns:a="http://schemas.openxmlformats.org/drawingml/2006/main" noChangeAspect="1"/>
+            </wp:cNvGraphicFramePr>
+            <a:graphic xmlns:a="http://schemas.openxmlformats.org/drawingml/2006/main">
+              <a:graphicData uri="http://schemas.openxmlformats.org/drawingml/2006/picture">
+                <pic:pic xmlns:pic="http://schemas.openxmlformats.org/drawingml/2006/picture">
+                  <pic:nvPicPr>
+                    <pic:cNvPr id="53590982" name=""/>
+                    <pic:cNvPicPr/>
+                  </pic:nvPicPr>
+                  <pic:blipFill>
+                    <a:blip r:embed="rId6"/>
+                    <a:stretch>
+                      <a:fillRect/>
+                    </a:stretch>
+                  </pic:blipFill>
+                  <pic:spPr>
+                    <a:xfrm>
+                      <a:off x="0" y="0"/>
+                      <a:ext cx="5943600" cy="2810510"/>
                     </a:xfrm>
                     <a:prstGeom prst="rect">
                       <a:avLst/>
@@ -981,6 +1043,29 @@
       <w:spacing w:val="5"/>
     </w:rPr>
   </w:style>
+  <w:style w:type="character" w:styleId="Hyperlink">
+    <w:name w:val="Hyperlink"/>
+    <w:basedOn w:val="DefaultParagraphFont"/>
+    <w:uiPriority w:val="99"/>
+    <w:unhideWhenUsed/>
+    <w:rsid w:val="00C1185F"/>
+    <w:rPr>
+      <w:color w:val="467886" w:themeColor="hyperlink"/>
+      <w:u w:val="single"/>
+    </w:rPr>
+  </w:style>
+  <w:style w:type="character" w:styleId="UnresolvedMention">
+    <w:name w:val="Unresolved Mention"/>
+    <w:basedOn w:val="DefaultParagraphFont"/>
+    <w:uiPriority w:val="99"/>
+    <w:semiHidden/>
+    <w:unhideWhenUsed/>
+    <w:rsid w:val="00C1185F"/>
+    <w:rPr>
+      <w:color w:val="605E5C"/>
+      <w:shd w:val="clear" w:color="auto" w:fill="E1DFDD"/>
+    </w:rPr>
+  </w:style>
 </w:styles>
 </file>
 

</xml_diff>

<commit_message>
Pushing 03/26/26, Added GitHub Screenshot to 1_2 Assignment Word Doc
</commit_message>
<xml_diff>
--- a/module-1/Shinsato-Assignment1_2.docx
+++ b/module-1/Shinsato-Assignment1_2.docx
@@ -34,13 +34,8 @@
     </w:p>
     <w:p/>
     <w:p>
-      <w:proofErr w:type="spellStart"/>
       <w:r>
-        <w:t>Github</w:t>
-      </w:r>
-      <w:proofErr w:type="spellEnd"/>
-      <w:r>
-        <w:t xml:space="preserve"> </w:t>
+        <w:t xml:space="preserve">Github </w:t>
       </w:r>
       <w:r>
         <w:t xml:space="preserve">URL of Repository: </w:t>
@@ -57,6 +52,45 @@
     <w:p>
       <w:r>
         <w:t>Screenshot of GitHub Repository</w:t>
+      </w:r>
+    </w:p>
+    <w:p>
+      <w:r>
+        <w:drawing>
+          <wp:inline distT="0" distB="0" distL="0" distR="0" wp14:anchorId="3C5659FB" wp14:editId="704B8192">
+            <wp:extent cx="5943600" cy="3099435"/>
+            <wp:effectExtent l="0" t="0" r="0" b="5715"/>
+            <wp:docPr id="1079315232" name="Picture 1"/>
+            <wp:cNvGraphicFramePr>
+              <a:graphicFrameLocks xmlns:a="http://schemas.openxmlformats.org/drawingml/2006/main" noChangeAspect="1"/>
+            </wp:cNvGraphicFramePr>
+            <a:graphic xmlns:a="http://schemas.openxmlformats.org/drawingml/2006/main">
+              <a:graphicData uri="http://schemas.openxmlformats.org/drawingml/2006/picture">
+                <pic:pic xmlns:pic="http://schemas.openxmlformats.org/drawingml/2006/picture">
+                  <pic:nvPicPr>
+                    <pic:cNvPr id="1079315232" name=""/>
+                    <pic:cNvPicPr/>
+                  </pic:nvPicPr>
+                  <pic:blipFill>
+                    <a:blip r:embed="rId5"/>
+                    <a:stretch>
+                      <a:fillRect/>
+                    </a:stretch>
+                  </pic:blipFill>
+                  <pic:spPr>
+                    <a:xfrm>
+                      <a:off x="0" y="0"/>
+                      <a:ext cx="5943600" cy="3099435"/>
+                    </a:xfrm>
+                    <a:prstGeom prst="rect">
+                      <a:avLst/>
+                    </a:prstGeom>
+                  </pic:spPr>
+                </pic:pic>
+              </a:graphicData>
+            </a:graphic>
+          </wp:inline>
+        </w:drawing>
       </w:r>
     </w:p>
     <w:p>
@@ -90,7 +124,7 @@
                     <pic:cNvPicPr/>
                   </pic:nvPicPr>
                   <pic:blipFill>
-                    <a:blip r:embed="rId5"/>
+                    <a:blip r:embed="rId6"/>
                     <a:stretch>
                       <a:fillRect/>
                     </a:stretch>
@@ -113,6 +147,7 @@
     </w:p>
     <w:p>
       <w:r>
+        <w:lastRenderedPageBreak/>
         <w:t>Screenshot of local directory through Windows Explorer</w:t>
       </w:r>
       <w:r>
@@ -138,7 +173,7 @@
                     <pic:cNvPicPr/>
                   </pic:nvPicPr>
                   <pic:blipFill>
-                    <a:blip r:embed="rId6"/>
+                    <a:blip r:embed="rId7"/>
                     <a:stretch>
                       <a:fillRect/>
                     </a:stretch>

</xml_diff>

<commit_message>
Pushing 03/26/26, Fixed a typo on the 1_2 Word Doc
</commit_message>
<xml_diff>
--- a/module-1/Shinsato-Assignment1_2.docx
+++ b/module-1/Shinsato-Assignment1_2.docx
@@ -34,8 +34,13 @@
     </w:p>
     <w:p/>
     <w:p>
-      <w:r>
-        <w:t xml:space="preserve">Github </w:t>
+      <w:proofErr w:type="spellStart"/>
+      <w:r>
+        <w:t>Github</w:t>
+      </w:r>
+      <w:proofErr w:type="spellEnd"/>
+      <w:r>
+        <w:t xml:space="preserve"> </w:t>
       </w:r>
       <w:r>
         <w:t xml:space="preserve">URL of Repository: </w:t>
@@ -45,7 +50,19 @@
           <w:rPr>
             <w:rStyle w:val="Hyperlink"/>
           </w:rPr>
-          <w:t>https://github.com/MShinBV/csd-420.git</w:t>
+          <w:t>https://github.c</w:t>
+        </w:r>
+        <w:r>
+          <w:rPr>
+            <w:rStyle w:val="Hyperlink"/>
+          </w:rPr>
+          <w:t>o</w:t>
+        </w:r>
+        <w:r>
+          <w:rPr>
+            <w:rStyle w:val="Hyperlink"/>
+          </w:rPr>
+          <w:t>m/MShinBV/csd-420</w:t>
         </w:r>
       </w:hyperlink>
     </w:p>
@@ -56,6 +73,9 @@
     </w:p>
     <w:p>
       <w:r>
+        <w:rPr>
+          <w:noProof/>
+        </w:rPr>
         <w:drawing>
           <wp:inline distT="0" distB="0" distL="0" distR="0" wp14:anchorId="3C5659FB" wp14:editId="704B8192">
             <wp:extent cx="5943600" cy="3099435"/>
@@ -1144,6 +1164,18 @@
       <w:shd w:val="clear" w:color="auto" w:fill="E1DFDD"/>
     </w:rPr>
   </w:style>
+  <w:style w:type="character" w:styleId="FollowedHyperlink">
+    <w:name w:val="FollowedHyperlink"/>
+    <w:basedOn w:val="DefaultParagraphFont"/>
+    <w:uiPriority w:val="99"/>
+    <w:semiHidden/>
+    <w:unhideWhenUsed/>
+    <w:rsid w:val="0019596C"/>
+    <w:rPr>
+      <w:color w:val="96607D" w:themeColor="followedHyperlink"/>
+      <w:u w:val="single"/>
+    </w:rPr>
+  </w:style>
 </w:styles>
 </file>
 

</xml_diff>